<commit_message>
Simplify settings page presentation and clarify save actions.
Reduce visual clutter by collapsing advanced guidance/model comparison by default, and make section-level save buttons explicit while preserving existing settings behavior.

Made-with: Cursor
</commit_message>
<xml_diff>
--- a/bulletin-final/template/TEMPLATE.docx
+++ b/bulletin-final/template/TEMPLATE.docx
@@ -211,6 +211,42 @@
     </w:p>
     <w:p>
       <w:pPr>
+        <w:pStyle w:val="ListParagraph"/>
+        <w:numPr>
+          <w:ilvl w:val="0"/>
+          <w:numId w:val="3"/>
+        </w:numPr>
+        <w:spacing w:before="20" w:after="20"/>
+      </w:pPr>
+      <w:r>
+        <w:t>{{EVENT_ITEM}}</w:t>
+      </w:r>
+    </w:p>
+    <w:p>
+      <w:pPr>
+        <w:pStyle w:val="ListParagraph"/>
+        <w:numPr>
+          <w:ilvl w:val="0"/>
+          <w:numId w:val="3"/>
+        </w:numPr>
+        <w:spacing w:before="20" w:after="20"/>
+      </w:pPr>
+      <w:r>
+        <w:t>{{EVENT_ITEM}}</w:t>
+      </w:r>
+    </w:p>
+    <w:p>
+      <w:pPr>
+        <w:pStyle w:val="ListParagraph"/>
+        <w:numPr>
+          <w:ilvl w:val="0"/>
+          <w:numId w:val="3"/>
+        </w:numPr>
+        <w:spacing w:before="20" w:after="20"/>
+      </w:pPr>
+    </w:p>
+    <w:p>
+      <w:pPr>
         <w:shd w:val="clear" w:color="auto" w:fill="2E75B6"/>
         <w:spacing w:before="200" w:after="100"/>
       </w:pPr>
@@ -223,6 +259,32 @@
           <w:szCs w:val="22"/>
         </w:rPr>
         <w:t>3. PRAYER &amp; SHARING</w:t>
+      </w:r>
+    </w:p>
+    <w:p>
+      <w:pPr>
+        <w:pStyle w:val="ListParagraph"/>
+        <w:numPr>
+          <w:ilvl w:val="0"/>
+          <w:numId w:val="4"/>
+        </w:numPr>
+        <w:spacing w:before="20" w:after="20"/>
+      </w:pPr>
+      <w:r>
+        <w:t>{{IN_SERVICE}}</w:t>
+      </w:r>
+    </w:p>
+    <w:p>
+      <w:pPr>
+        <w:pStyle w:val="ListParagraph"/>
+        <w:numPr>
+          <w:ilvl w:val="0"/>
+          <w:numId w:val="4"/>
+        </w:numPr>
+        <w:spacing w:before="20" w:after="20"/>
+      </w:pPr>
+      <w:r>
+        <w:t>{{IN_SERVICE}}</w:t>
       </w:r>
     </w:p>
     <w:p>

</xml_diff>